<commit_message>
Updating the code evaluation rubric.
</commit_message>
<xml_diff>
--- a/docs/CodeEvaluationRubric-DesignGuidelines.docx
+++ b/docs/CodeEvaluationRubric-DesignGuidelines.docx
@@ -994,6 +994,24 @@
           <w:numId w:val="1"/>
         </w:numPr>
         <w:ind w:left="1440" w:hanging="360"/>
+        <w:rPr>
+          <w:u w:val="none"/>
+        </w:rPr>
+      </w:pPr>
+      <w:r>
+        <w:rPr>
+          <w:rtl w:val="0"/>
+        </w:rPr>
+        <w:t xml:space="preserve">Function names should describe the semantic result of the operation rather than the serialization format, parsing mechanism, or internal representation used to produce it.</w:t>
+      </w:r>
+    </w:p>
+    <w:p>
+      <w:pPr>
+        <w:numPr>
+          <w:ilvl w:val="1"/>
+          <w:numId w:val="1"/>
+        </w:numPr>
+        <w:ind w:left="1440" w:hanging="360"/>
       </w:pPr>
       <w:r>
         <w:rPr>
@@ -3720,7 +3738,7 @@
         <w:rPr>
           <w:rtl w:val="0"/>
         </w:rPr>
-        <w:t xml:space="preserve">reStructuredText is the preferred style, though NumPy or Google styles are acceptable alternatives if used consistently.</w:t>
+        <w:t xml:space="preserve">Google style is the preferred style, though NumPy or reStructuredText styles are acceptable alternatives if used consistently.</w:t>
       </w:r>
     </w:p>
     <w:p>
@@ -4408,6 +4426,24 @@
           <w:rtl w:val="0"/>
         </w:rPr>
         <w:t xml:space="preserve">If additional wording would not change how a competent caller uses the function, it is likely unnecessary.</w:t>
+      </w:r>
+    </w:p>
+    <w:p>
+      <w:pPr>
+        <w:numPr>
+          <w:ilvl w:val="1"/>
+          <w:numId w:val="9"/>
+        </w:numPr>
+        <w:ind w:left="1440" w:hanging="360"/>
+        <w:rPr>
+          <w:u w:val="none"/>
+        </w:rPr>
+      </w:pPr>
+      <w:r>
+        <w:rPr>
+          <w:rtl w:val="0"/>
+        </w:rPr>
+        <w:t xml:space="preserve">The docstring describes observable behavior rather than internal implementation details. The implementation could change without requiring the docstring to change.</w:t>
       </w:r>
       <w:r>
         <w:rPr>

</xml_diff>